<commit_message>
Update 18/02/2026 - 17:27
</commit_message>
<xml_diff>
--- a/paper/paper_gas_operability_v2.docx
+++ b/paper/paper_gas_operability_v2.docx
@@ -33,7 +33,14 @@
         <w:rPr>
           <w:vertAlign w:val="superscript"/>
         </w:rPr>
-        <w:t xml:space="preserve"> a</w:t>
+        <w:t xml:space="preserve"> </w:t>
+      </w:r>
+      <w:proofErr w:type="gramStart"/>
+      <w:r>
+        <w:rPr>
+          <w:vertAlign w:val="superscript"/>
+        </w:rPr>
+        <w:t>a</w:t>
       </w:r>
       <w:r>
         <w:t xml:space="preserve">, </w:t>
@@ -43,6 +50,7 @@
         <w:t>Roymel</w:t>
       </w:r>
       <w:proofErr w:type="spellEnd"/>
+      <w:proofErr w:type="gramEnd"/>
       <w:r>
         <w:t xml:space="preserve"> R. Carpio</w:t>
       </w:r>
@@ -176,17 +184,30 @@
         </w:rPr>
         <w:t xml:space="preserve">E-mail: </w:t>
       </w:r>
-      <w:hyperlink r:id="rId7" w:history="1">
-        <w:r>
-          <w:rPr>
-            <w:rStyle w:val="Hyperlink"/>
-            <w:sz w:val="20"/>
-            <w:szCs w:val="20"/>
-            <w:lang w:val="en-US"/>
-          </w:rPr>
-          <w:t>roymel@eq.ufrj.br</w:t>
-        </w:r>
-      </w:hyperlink>
+      <w:r>
+        <w:fldChar w:fldCharType="begin"/>
+      </w:r>
+      <w:r>
+        <w:rPr>
+          <w:lang w:val="en-US"/>
+        </w:rPr>
+        <w:instrText>HYPERLINK "mailto:roymel@eq.ufrj.br"</w:instrText>
+      </w:r>
+      <w:r>
+        <w:fldChar w:fldCharType="separate"/>
+      </w:r>
+      <w:r>
+        <w:rPr>
+          <w:rStyle w:val="Hyperlink"/>
+          <w:sz w:val="20"/>
+          <w:szCs w:val="20"/>
+          <w:lang w:val="en-US"/>
+        </w:rPr>
+        <w:t>roymel@eq.ufrj.br</w:t>
+      </w:r>
+      <w:r>
+        <w:fldChar w:fldCharType="end"/>
+      </w:r>
     </w:p>
     <w:p>
       <w:pPr>
@@ -327,7 +348,21 @@
         <w:rPr>
           <w:lang w:val="en-US"/>
         </w:rPr>
-        <w:t xml:space="preserve">Natural gas processing plants must satisfy multiple product-quality specifications simultaneously while maximizing revenue; yet conventional optimization approaches focus on identifying single optimal operating points without characterizing the extent of the feasible operating region. This limitation leaves critical questions unanswered: how much of the available operating space actually meets all specifications? Which constraints are the true bottlenecks? And how do inter-constraint couplings shape the feasible envelope? This work addresses these gaps by applying the Georgakis process operability framework — traditionally used in reactor design and process intensification — to a conventional natural gas processing plant for the first time. The plant, modelled in the open-source simulator DWSIM with the Peng–Robinson equation of state, considers the processing of a 16-component Brazilian natural gas and comprises several gas-liquid separators, three distillation columns, and other auxiliary unit operations. Five manipulable variables were systematically varied across 2,000 Latin Hypercube Sampling scenarios, and the resulting outputs were evaluated against four product-quality constraints derived from ANP regulatory standards. The Operability Index reveals a severely constrained process in which most technically accessible operating conditions fail to produce compliant products. Constraint </w:t>
+        <w:t xml:space="preserve">Natural gas processing plants must satisfy multiple product-quality specifications simultaneously while maximizing revenue; yet conventional optimization approaches focus on identifying single optimal operating points without characterizing the extent of the feasible operating region. This limitation leaves critical questions unanswered: how much of the available operating space </w:t>
+      </w:r>
+      <w:proofErr w:type="gramStart"/>
+      <w:r>
+        <w:rPr>
+          <w:lang w:val="en-US"/>
+        </w:rPr>
+        <w:t>actually meets</w:t>
+      </w:r>
+      <w:proofErr w:type="gramEnd"/>
+      <w:r>
+        <w:rPr>
+          <w:lang w:val="en-US"/>
+        </w:rPr>
+        <w:t xml:space="preserve"> all specifications? Which constraints are the true bottlenecks? And how do inter-constraint couplings shape the feasible envelope? This work addresses these gaps by applying the Georgakis process operability framework — traditionally used in reactor design and process intensification — to a conventional natural gas processing plant for the first time. The plant, modelled in the open-source simulator DWSIM with the Peng–Robinson equation of state, considers the processing of a 16-component Brazilian natural gas and comprises several gas-liquid separators, three distillation columns, and other auxiliary unit operations. Five manipulable variables were systematically varied across 2,000 Latin Hypercube Sampling scenarios, and the resulting outputs were evaluated against four product-quality constraints derived from ANP regulatory standards. The Operability Index reveals a severely constrained process in which most technically accessible operating conditions fail to produce compliant products. Constraint </w:t>
       </w:r>
       <w:r>
         <w:rPr>
@@ -342,21 +377,71 @@
           <w:iCs/>
           <w:lang w:val="en-US"/>
         </w:rPr>
-        <w:t>where is the best operating point?</w:t>
-      </w:r>
-      <w:r>
-        <w:rPr>
-          <w:lang w:val="en-US"/>
-        </w:rPr>
-        <w:t xml:space="preserve"> it asks </w:t>
-      </w:r>
+        <w:t xml:space="preserve">where </w:t>
+      </w:r>
+      <w:proofErr w:type="gramStart"/>
       <w:r>
         <w:rPr>
           <w:i/>
           <w:iCs/>
           <w:lang w:val="en-US"/>
         </w:rPr>
-        <w:t>how large is the space of acceptable operation?</w:t>
+        <w:t>is the best operating point</w:t>
+      </w:r>
+      <w:proofErr w:type="gramEnd"/>
+      <w:r>
+        <w:rPr>
+          <w:i/>
+          <w:iCs/>
+          <w:lang w:val="en-US"/>
+        </w:rPr>
+        <w:t>?</w:t>
+      </w:r>
+      <w:r>
+        <w:rPr>
+          <w:lang w:val="en-US"/>
+        </w:rPr>
+        <w:t xml:space="preserve"> </w:t>
+      </w:r>
+      <w:proofErr w:type="gramStart"/>
+      <w:r>
+        <w:rPr>
+          <w:lang w:val="en-US"/>
+        </w:rPr>
+        <w:t>it</w:t>
+      </w:r>
+      <w:proofErr w:type="gramEnd"/>
+      <w:r>
+        <w:rPr>
+          <w:lang w:val="en-US"/>
+        </w:rPr>
+        <w:t xml:space="preserve"> asks </w:t>
+      </w:r>
+      <w:r>
+        <w:rPr>
+          <w:i/>
+          <w:iCs/>
+          <w:lang w:val="en-US"/>
+        </w:rPr>
+        <w:t xml:space="preserve">how large </w:t>
+      </w:r>
+      <w:proofErr w:type="gramStart"/>
+      <w:r>
+        <w:rPr>
+          <w:i/>
+          <w:iCs/>
+          <w:lang w:val="en-US"/>
+        </w:rPr>
+        <w:t>is the space of acceptable operation</w:t>
+      </w:r>
+      <w:proofErr w:type="gramEnd"/>
+      <w:r>
+        <w:rPr>
+          <w:i/>
+          <w:iCs/>
+          <w:lang w:val="en-US"/>
+        </w:rPr>
+        <w:t>?</w:t>
       </w:r>
       <w:r>
         <w:rPr>
@@ -1307,6 +1392,7 @@
             <w:pPr>
               <w:spacing w:line="276" w:lineRule="auto"/>
             </w:pPr>
+            <w:proofErr w:type="gramStart"/>
             <w:r>
               <w:rPr>
                 <w:b/>
@@ -1314,7 +1400,17 @@
                 <w:sz w:val="18"/>
                 <w:szCs w:val="18"/>
               </w:rPr>
-              <w:t>M(·)</w:t>
+              <w:t>M(</w:t>
+            </w:r>
+            <w:proofErr w:type="gramEnd"/>
+            <w:r>
+              <w:rPr>
+                <w:b/>
+                <w:bCs/>
+                <w:sz w:val="18"/>
+                <w:szCs w:val="18"/>
+              </w:rPr>
+              <w:t>·)</w:t>
             </w:r>
           </w:p>
         </w:tc>
@@ -2530,6 +2626,7 @@
             <w:pPr>
               <w:spacing w:line="276" w:lineRule="auto"/>
             </w:pPr>
+            <w:proofErr w:type="gramStart"/>
             <w:r>
               <w:rPr>
                 <w:b/>
@@ -2537,7 +2634,17 @@
                 <w:sz w:val="18"/>
                 <w:szCs w:val="18"/>
               </w:rPr>
-              <w:t>μ(·)</w:t>
+              <w:t>μ(</w:t>
+            </w:r>
+            <w:proofErr w:type="gramEnd"/>
+            <w:r>
+              <w:rPr>
+                <w:b/>
+                <w:bCs/>
+                <w:sz w:val="18"/>
+                <w:szCs w:val="18"/>
+              </w:rPr>
+              <w:t>·)</w:t>
             </w:r>
           </w:p>
         </w:tc>
@@ -2715,7 +2822,25 @@
           <w:iCs/>
           <w:lang w:val="en-US"/>
         </w:rPr>
-        <w:t>how much of the available operating space actually satisfies all specifications simultaneously</w:t>
+        <w:t xml:space="preserve">how much of the available operating space </w:t>
+      </w:r>
+      <w:proofErr w:type="gramStart"/>
+      <w:r>
+        <w:rPr>
+          <w:i/>
+          <w:iCs/>
+          <w:lang w:val="en-US"/>
+        </w:rPr>
+        <w:t>actually satisfies</w:t>
+      </w:r>
+      <w:proofErr w:type="gramEnd"/>
+      <w:r>
+        <w:rPr>
+          <w:i/>
+          <w:iCs/>
+          <w:lang w:val="en-US"/>
+        </w:rPr>
+        <w:t xml:space="preserve"> all specifications simultaneously</w:t>
       </w:r>
       <w:r>
         <w:rPr>
@@ -2737,7 +2862,21 @@
         <w:rPr>
           <w:lang w:val="en-US"/>
         </w:rPr>
-        <w:t xml:space="preserve">The process operability framework, introduced by Vinson and Georgakis (2000) and subsequently extended by Georgakis et al. (2003) and Subramanian and Georgakis (2005), provides a rigorous methodology for addressing this question. The framework maps the Available Input Set (AIS)—the space of manipulable decision variables—through the process model to obtain the Achievable Output Set (AOS), and then quantifies the overlap between the AOS and the Desired Output Set (DOS)—the region of acceptable product quality—through the Operability Index (OI). An OI of 100% indicates that every achievable output meets specifications; lower values reveal constrained </w:t>
+        <w:t>The process operability framework, introduced by Vinson and Georgakis (2000) and subsequently extended by Georgakis et al. (2003) and Subramanian and Georgakis (2005), provides a rigorous methodology for addressing this question. The framework maps the Available Input Set (AIS)—the space of manipulable decision variables—through the process model to obtain the Achievable Output Set (AOS</w:t>
+      </w:r>
+      <w:proofErr w:type="gramStart"/>
+      <w:r>
+        <w:rPr>
+          <w:lang w:val="en-US"/>
+        </w:rPr>
+        <w:t>), and</w:t>
+      </w:r>
+      <w:proofErr w:type="gramEnd"/>
+      <w:r>
+        <w:rPr>
+          <w:lang w:val="en-US"/>
+        </w:rPr>
+        <w:t xml:space="preserve"> then quantifies the overlap between the AOS and the Desired Output Set (DOS)—the region of acceptable product quality—through the Operability Index (OI). An OI of 100% indicates that every achievable output meets specifications; lower values reveal constrained </w:t>
       </w:r>
       <w:r>
         <w:rPr>
@@ -2890,8 +3029,16 @@
         <w:rPr>
           <w:lang w:val="en-US"/>
         </w:rPr>
-        <w:t>Available Input Set (AIS): the range of input variables that the process can physically access, defined by equipment and safety limits;</w:t>
-      </w:r>
+        <w:t xml:space="preserve">Available Input Set (AIS): the range of input variables that the process can physically access, defined by equipment and safety </w:t>
+      </w:r>
+      <w:proofErr w:type="gramStart"/>
+      <w:r>
+        <w:rPr>
+          <w:lang w:val="en-US"/>
+        </w:rPr>
+        <w:t>limits;</w:t>
+      </w:r>
+      <w:proofErr w:type="gramEnd"/>
     </w:p>
     <w:p>
       <w:pPr>
@@ -2923,8 +3070,16 @@
         <w:rPr>
           <w:lang w:val="en-US"/>
         </w:rPr>
-        <w:t xml:space="preserve"> AIS;</w:t>
-      </w:r>
+        <w:t xml:space="preserve"> </w:t>
+      </w:r>
+      <w:proofErr w:type="gramStart"/>
+      <w:r>
+        <w:rPr>
+          <w:lang w:val="en-US"/>
+        </w:rPr>
+        <w:t>AIS;</w:t>
+      </w:r>
+      <w:proofErr w:type="gramEnd"/>
     </w:p>
     <w:p>
       <w:pPr>
@@ -2967,8 +3122,29 @@
         <w:spacing w:after="120" w:line="360" w:lineRule="auto"/>
         <w:jc w:val="center"/>
       </w:pPr>
-      <w:r>
-        <w:t>OI = μ(AOS ∩ DOS) / μ(DOS)    (1)</w:t>
+      <w:proofErr w:type="gramStart"/>
+      <w:r>
+        <w:t>OI</w:t>
+      </w:r>
+      <w:proofErr w:type="gramEnd"/>
+      <w:r>
+        <w:t xml:space="preserve"> = </w:t>
+      </w:r>
+      <w:proofErr w:type="gramStart"/>
+      <w:r>
+        <w:t>μ(</w:t>
+      </w:r>
+      <w:proofErr w:type="gramEnd"/>
+      <w:r>
+        <w:t>AOS ∩ DOS) / μ(</w:t>
+      </w:r>
+      <w:proofErr w:type="gramStart"/>
+      <w:r>
+        <w:t xml:space="preserve">DOS)   </w:t>
+      </w:r>
+      <w:proofErr w:type="gramEnd"/>
+      <w:r>
+        <w:t xml:space="preserve"> (1)</w:t>
       </w:r>
     </w:p>
     <w:p>
@@ -3028,7 +3204,21 @@
         <w:rPr>
           <w:lang w:val="en-US"/>
         </w:rPr>
-        <w:t xml:space="preserve">The natural gas processing plant was simulated using DWSIM version 9.0.5 (Medeiros, 2024), an open-source, CAPE-OPEN compliant chemical process simulator. The simulation model comprises two highly integrated processing units: a Dew Point Unit (DPU), which processes the vapor phase from the slug catchers, and a Liquid Fractionation Unit (LFU), which handles the condensate. These units are tightly coupled due to significant material recycle streams; specifically, lighter condensate from the DPU is sent to the LFU for stabilization, while off-gas from the LFU is recycled back to the DPU for further recovery. The main products of the facility are: (1) Sales Gas, (2) Liquefied Petroleum Gas, and (3) Natural Gasoline, a stream with components heavier than C₄. </w:t>
+        <w:t xml:space="preserve">The natural gas processing plant was simulated using DWSIM version 9.0.5 (Medeiros, 2024), an open-source, CAPE-OPEN compliant chemical process simulator. The simulation model comprises two highly integrated processing units: a Dew Point Unit (DPU), which processes the vapor phase from the slug catchers, and a Liquid Fractionation Unit (LFU), which handles the condensate. These units are tightly coupled due to significant material recycle streams; specifically, lighter condensate from the DPU is sent to the LFU for stabilization, while </w:t>
+      </w:r>
+      <w:proofErr w:type="gramStart"/>
+      <w:r>
+        <w:rPr>
+          <w:lang w:val="en-US"/>
+        </w:rPr>
+        <w:t>off-gas</w:t>
+      </w:r>
+      <w:proofErr w:type="gramEnd"/>
+      <w:r>
+        <w:rPr>
+          <w:lang w:val="en-US"/>
+        </w:rPr>
+        <w:t xml:space="preserve"> from the LFU is recycled back to the DPU for further recovery. The main products of the facility are: (1) Sales Gas, (2) Liquefied Petroleum Gas, and (3) Natural Gasoline, a stream with components heavier than C₄. </w:t>
       </w:r>
       <w:r>
         <w:t xml:space="preserve">The complete </w:t>
@@ -3063,7 +3253,15 @@
       </w:r>
       <w:proofErr w:type="spellEnd"/>
       <w:r>
-        <w:t xml:space="preserve"> in Figure 1.</w:t>
+        <w:t xml:space="preserve"> </w:t>
+      </w:r>
+      <w:proofErr w:type="gramStart"/>
+      <w:r>
+        <w:t>in Figure</w:t>
+      </w:r>
+      <w:proofErr w:type="gramEnd"/>
+      <w:r>
+        <w:t xml:space="preserve"> 1.</w:t>
       </w:r>
     </w:p>
     <w:p>
@@ -3072,6 +3270,9 @@
         <w:jc w:val="center"/>
       </w:pPr>
       <w:r>
+        <w:rPr>
+          <w:noProof/>
+        </w:rPr>
         <w:drawing>
           <wp:inline distT="0" distB="0" distL="0" distR="0" wp14:anchorId="1DAF8054" wp14:editId="70DAE94F">
             <wp:extent cx="5182049" cy="3566469"/>
@@ -3088,7 +3289,7 @@
                     <pic:cNvPicPr/>
                   </pic:nvPicPr>
                   <pic:blipFill>
-                    <a:blip r:embed="rId8"/>
+                    <a:blip r:embed="rId7"/>
                     <a:stretch>
                       <a:fillRect/>
                     </a:stretch>
@@ -6652,7 +6853,21 @@
         <w:rPr>
           <w:lang w:val="en-US"/>
         </w:rPr>
-        <w:t xml:space="preserve"> equally probable intervals and samples exactly once from each interval, producing a space-filling design with superior coverage compared to simple random sampling at the same sample size. Each of the 2,000 input combinations was evaluated through the DWSIM flowsheet model to obtain the corresponding output values (Revenue, SG_C1, LPG_C2, LPG_C5, NG_RVP), generating the AOS.</w:t>
+        <w:t xml:space="preserve"> equally probable intervals and samples exactly once from each interval, producing a space-filling design with superior coverage compared to simple random sampling at the </w:t>
+      </w:r>
+      <w:proofErr w:type="gramStart"/>
+      <w:r>
+        <w:rPr>
+          <w:lang w:val="en-US"/>
+        </w:rPr>
+        <w:t>same sample</w:t>
+      </w:r>
+      <w:proofErr w:type="gramEnd"/>
+      <w:r>
+        <w:rPr>
+          <w:lang w:val="en-US"/>
+        </w:rPr>
+        <w:t xml:space="preserve"> size. Each of the 2,000 input combinations was evaluated through the DWSIM flowsheet model to obtain the corresponding output values (Revenue, SG_C1, LPG_C2, LPG_C5, NG_RVP), generating the AOS.</w:t>
       </w:r>
     </w:p>
     <w:p>
@@ -6668,7 +6883,35 @@
         <w:rPr>
           <w:lang w:val="en-US"/>
         </w:rPr>
-        <w:t>The choice of N = 2,000 provides a balance between computational cost and statistical precision. For the observed OI of 14.1%, the binomial standard error is SE = [OI(1 − OI)/N]½ ≈ 0.78 percentage points, yielding a 95% confidence interval of approximately [12.6%, 15.6%].</w:t>
+        <w:t>The choice of N = 2,000 provides a balance between computational cost and statistical precision. For the observed OI of 14.1%, the binomial standard error is SE = [</w:t>
+      </w:r>
+      <w:proofErr w:type="gramStart"/>
+      <w:r>
+        <w:rPr>
+          <w:lang w:val="en-US"/>
+        </w:rPr>
+        <w:t>OI(</w:t>
+      </w:r>
+      <w:proofErr w:type="gramEnd"/>
+      <w:r>
+        <w:rPr>
+          <w:lang w:val="en-US"/>
+        </w:rPr>
+        <w:t>1 − OI)/</w:t>
+      </w:r>
+      <w:proofErr w:type="gramStart"/>
+      <w:r>
+        <w:rPr>
+          <w:lang w:val="en-US"/>
+        </w:rPr>
+        <w:t>N]½</w:t>
+      </w:r>
+      <w:proofErr w:type="gramEnd"/>
+      <w:r>
+        <w:rPr>
+          <w:lang w:val="en-US"/>
+        </w:rPr>
+        <w:t xml:space="preserve"> ≈ 0.78 percentage points, yielding a 95% confidence interval of approximately [12.6%, 15.6%].</w:t>
       </w:r>
     </w:p>
     <w:p>
@@ -6748,7 +6991,35 @@
         <w:rPr>
           <w:lang w:val="en-US"/>
         </w:rPr>
-        <w:t>Table 4 reports the individual constraint satisfaction rates. Constraint g₁ (methane in SG ≥ 80) is universally satisfied across all 2,000 scenarios, indicating that methane content in the SG is never a binding constraint within the explored AIS. In contrast, g₄ (RVP of NG ≤ 76 kPa) is the most restrictive constraint, satisfied by only 48.5% of scenarios individually. Constraints g₂ (ethane in LPG ≤ 12 mol%) and g₃ (C₅₊ in LPG ≤ 2 mol%) show intermediate satisfaction rates of 56.2% and 74.7%, respectively.</w:t>
+        <w:t xml:space="preserve">Table 4 </w:t>
+      </w:r>
+      <w:proofErr w:type="gramStart"/>
+      <w:r>
+        <w:rPr>
+          <w:lang w:val="en-US"/>
+        </w:rPr>
+        <w:t>reports</w:t>
+      </w:r>
+      <w:proofErr w:type="gramEnd"/>
+      <w:r>
+        <w:rPr>
+          <w:lang w:val="en-US"/>
+        </w:rPr>
+        <w:t xml:space="preserve"> the </w:t>
+      </w:r>
+      <w:proofErr w:type="gramStart"/>
+      <w:r>
+        <w:rPr>
+          <w:lang w:val="en-US"/>
+        </w:rPr>
+        <w:t>individual constraint</w:t>
+      </w:r>
+      <w:proofErr w:type="gramEnd"/>
+      <w:r>
+        <w:rPr>
+          <w:lang w:val="en-US"/>
+        </w:rPr>
+        <w:t xml:space="preserve"> satisfaction rates. Constraint g₁ (methane in SG ≥ 80) is universally satisfied across all 2,000 scenarios, indicating that methane content in the SG is never a binding constraint within the explored AIS. In contrast, g₄ (RVP of NG ≤ 76 kPa) is the most restrictive constraint, satisfied by only 48.5% of scenarios individually. Constraints g₂ (ethane in LPG ≤ 12 mol%) and g₃ (C₅₊ in LPG ≤ 2 mol%) show intermediate satisfaction rates of 56.2% and 74.7%, respectively.</w:t>
       </w:r>
     </w:p>
     <w:p>
@@ -7762,7 +8033,7 @@
                     </pic:cNvPicPr>
                   </pic:nvPicPr>
                   <pic:blipFill>
-                    <a:blip r:embed="rId9"/>
+                    <a:blip r:embed="rId8"/>
                     <a:srcRect/>
                     <a:stretch>
                       <a:fillRect/>
@@ -8674,10 +8945,282 @@
           <w:noProof/>
         </w:rPr>
         <w:drawing>
-          <wp:inline distT="0" distB="0" distL="0" distR="0" wp14:anchorId="79B8AD9B" wp14:editId="3CE91011">
-            <wp:extent cx="4762500" cy="3914775"/>
+          <wp:inline distT="0" distB="0" distL="0" distR="0" wp14:anchorId="522851B5" wp14:editId="459C586E">
+            <wp:extent cx="5570012" cy="4572767"/>
             <wp:effectExtent l="0" t="0" r="0" b="0"/>
-            <wp:docPr id="517165867" name="Picture 517165867"/>
+            <wp:docPr id="227328902" name="Picture 1"/>
+            <wp:cNvGraphicFramePr>
+              <a:graphicFrameLocks xmlns:a="http://schemas.openxmlformats.org/drawingml/2006/main" noChangeAspect="1"/>
+            </wp:cNvGraphicFramePr>
+            <a:graphic xmlns:a="http://schemas.openxmlformats.org/drawingml/2006/main">
+              <a:graphicData uri="http://schemas.openxmlformats.org/drawingml/2006/picture">
+                <pic:pic xmlns:pic="http://schemas.openxmlformats.org/drawingml/2006/picture">
+                  <pic:nvPicPr>
+                    <pic:cNvPr id="227328902" name="Picture 227328902"/>
+                    <pic:cNvPicPr/>
+                  </pic:nvPicPr>
+                  <pic:blipFill>
+                    <a:blip r:embed="rId9" cstate="print">
+                      <a:extLst>
+                        <a:ext uri="{28A0092B-C50C-407E-A947-70E740481C1C}">
+                          <a14:useLocalDpi xmlns:a14="http://schemas.microsoft.com/office/drawing/2010/main" val="0"/>
+                        </a:ext>
+                      </a:extLst>
+                    </a:blip>
+                    <a:stretch>
+                      <a:fillRect/>
+                    </a:stretch>
+                  </pic:blipFill>
+                  <pic:spPr>
+                    <a:xfrm>
+                      <a:off x="0" y="0"/>
+                      <a:ext cx="5591457" cy="4590372"/>
+                    </a:xfrm>
+                    <a:prstGeom prst="rect">
+                      <a:avLst/>
+                    </a:prstGeom>
+                  </pic:spPr>
+                </pic:pic>
+              </a:graphicData>
+            </a:graphic>
+          </wp:inline>
+        </w:drawing>
+      </w:r>
+    </w:p>
+    <w:p>
+      <w:pPr>
+        <w:spacing w:before="60" w:after="200" w:line="276" w:lineRule="auto"/>
+        <w:jc w:val="both"/>
+        <w:rPr>
+          <w:lang w:val="en-US"/>
+        </w:rPr>
+      </w:pPr>
+      <w:r>
+        <w:rPr>
+          <w:i/>
+          <w:iCs/>
+          <w:sz w:val="18"/>
+          <w:szCs w:val="18"/>
+        </w:rPr>
+        <w:t xml:space="preserve">Fig. 4. Key </w:t>
+      </w:r>
+      <w:proofErr w:type="spellStart"/>
+      <w:r>
+        <w:rPr>
+          <w:i/>
+          <w:iCs/>
+          <w:sz w:val="18"/>
+          <w:szCs w:val="18"/>
+        </w:rPr>
+        <w:t>variable</w:t>
+      </w:r>
+      <w:proofErr w:type="spellEnd"/>
+      <w:r>
+        <w:rPr>
+          <w:i/>
+          <w:iCs/>
+          <w:sz w:val="18"/>
+          <w:szCs w:val="18"/>
+        </w:rPr>
+        <w:t xml:space="preserve"> </w:t>
+      </w:r>
+      <w:proofErr w:type="spellStart"/>
+      <w:r>
+        <w:rPr>
+          <w:i/>
+          <w:iCs/>
+          <w:sz w:val="18"/>
+          <w:szCs w:val="18"/>
+        </w:rPr>
+        <w:t>correlations</w:t>
+      </w:r>
+      <w:proofErr w:type="spellEnd"/>
+      <w:r>
+        <w:rPr>
+          <w:i/>
+          <w:iCs/>
+          <w:sz w:val="18"/>
+          <w:szCs w:val="18"/>
+        </w:rPr>
+        <w:t xml:space="preserve">. (a) V-02 </w:t>
+      </w:r>
+      <w:proofErr w:type="spellStart"/>
+      <w:r>
+        <w:rPr>
+          <w:i/>
+          <w:iCs/>
+          <w:sz w:val="18"/>
+          <w:szCs w:val="18"/>
+        </w:rPr>
+        <w:t>temperature</w:t>
+      </w:r>
+      <w:proofErr w:type="spellEnd"/>
+      <w:r>
+        <w:rPr>
+          <w:i/>
+          <w:iCs/>
+          <w:sz w:val="18"/>
+          <w:szCs w:val="18"/>
+        </w:rPr>
+        <w:t xml:space="preserve"> vs. </w:t>
+      </w:r>
+      <w:proofErr w:type="spellStart"/>
+      <w:r>
+        <w:rPr>
+          <w:i/>
+          <w:iCs/>
+          <w:sz w:val="18"/>
+          <w:szCs w:val="18"/>
+        </w:rPr>
+        <w:t>Revenue</w:t>
+      </w:r>
+      <w:proofErr w:type="spellEnd"/>
+      <w:r>
+        <w:rPr>
+          <w:i/>
+          <w:iCs/>
+          <w:sz w:val="18"/>
+          <w:szCs w:val="18"/>
+        </w:rPr>
+        <w:t xml:space="preserve"> (r = −0.984); (b) T-01 </w:t>
+      </w:r>
+      <w:proofErr w:type="spellStart"/>
+      <w:r>
+        <w:rPr>
+          <w:i/>
+          <w:iCs/>
+          <w:sz w:val="18"/>
+          <w:szCs w:val="18"/>
+        </w:rPr>
+        <w:t>reboiler</w:t>
+      </w:r>
+      <w:proofErr w:type="spellEnd"/>
+      <w:r>
+        <w:rPr>
+          <w:i/>
+          <w:iCs/>
+          <w:sz w:val="18"/>
+          <w:szCs w:val="18"/>
+        </w:rPr>
+        <w:t xml:space="preserve"> </w:t>
+      </w:r>
+      <w:proofErr w:type="spellStart"/>
+      <w:r>
+        <w:rPr>
+          <w:i/>
+          <w:iCs/>
+          <w:sz w:val="18"/>
+          <w:szCs w:val="18"/>
+        </w:rPr>
+        <w:t>temperature</w:t>
+      </w:r>
+      <w:proofErr w:type="spellEnd"/>
+      <w:r>
+        <w:rPr>
+          <w:i/>
+          <w:iCs/>
+          <w:sz w:val="18"/>
+          <w:szCs w:val="18"/>
+        </w:rPr>
+        <w:t xml:space="preserve"> vs. LPG_C2 (r = −0.970); (c) T-02 </w:t>
+      </w:r>
+      <w:proofErr w:type="spellStart"/>
+      <w:r>
+        <w:rPr>
+          <w:i/>
+          <w:iCs/>
+          <w:sz w:val="18"/>
+          <w:szCs w:val="18"/>
+        </w:rPr>
+        <w:t>reboiler</w:t>
+      </w:r>
+      <w:proofErr w:type="spellEnd"/>
+      <w:r>
+        <w:rPr>
+          <w:i/>
+          <w:iCs/>
+          <w:sz w:val="18"/>
+          <w:szCs w:val="18"/>
+        </w:rPr>
+        <w:t xml:space="preserve"> </w:t>
+      </w:r>
+      <w:proofErr w:type="spellStart"/>
+      <w:r>
+        <w:rPr>
+          <w:i/>
+          <w:iCs/>
+          <w:sz w:val="18"/>
+          <w:szCs w:val="18"/>
+        </w:rPr>
+        <w:t>temperature</w:t>
+      </w:r>
+      <w:proofErr w:type="spellEnd"/>
+      <w:r>
+        <w:rPr>
+          <w:i/>
+          <w:iCs/>
+          <w:sz w:val="18"/>
+          <w:szCs w:val="18"/>
+        </w:rPr>
+        <w:t xml:space="preserve"> vs. NG_RVP (r = −0.976); (d) LPG_C5 vs. NG_RVP (r = −0.650). </w:t>
+      </w:r>
+      <w:r>
+        <w:rPr>
+          <w:i/>
+          <w:iCs/>
+          <w:sz w:val="18"/>
+          <w:szCs w:val="18"/>
+          <w:lang w:val="en-US"/>
+        </w:rPr>
+        <w:t>Green: feasible; red: infeasible. Dashed lines show constraint boundaries.</w:t>
+      </w:r>
+    </w:p>
+    <w:p>
+      <w:pPr>
+        <w:pStyle w:val="Heading2"/>
+        <w:spacing w:line="360" w:lineRule="auto"/>
+        <w:rPr>
+          <w:lang w:val="en-US"/>
+        </w:rPr>
+      </w:pPr>
+      <w:r>
+        <w:rPr>
+          <w:lang w:val="en-US"/>
+        </w:rPr>
+        <w:t>3.4. The LPG_C5–NG_RVP Trade-off: A Fundamental Thermodynamic Coupling</w:t>
+      </w:r>
+    </w:p>
+    <w:p>
+      <w:pPr>
+        <w:spacing w:after="120" w:line="360" w:lineRule="auto"/>
+        <w:ind w:firstLine="706"/>
+        <w:jc w:val="both"/>
+        <w:rPr>
+          <w:lang w:val="en-US"/>
+        </w:rPr>
+      </w:pPr>
+      <w:r>
+        <w:rPr>
+          <w:lang w:val="en-US"/>
+        </w:rPr>
+        <w:t>The most consequential inter-output relationship is the inverse correlation between C₅₊ content in LPG (LPG_C5) and Reid Vapor Pressure of the NG stream (NG_RVP), with r = −0.650. Figure 3 visualizes this trade-off with the DOS boundary region and revenue color-coding.</w:t>
+      </w:r>
+    </w:p>
+    <w:p>
+      <w:pPr>
+        <w:spacing w:before="120" w:after="60"/>
+        <w:jc w:val="center"/>
+      </w:pPr>
+      <w:r>
+        <w:rPr>
+          <w:noProof/>
+        </w:rPr>
+        <w:lastRenderedPageBreak/>
+        <w:drawing>
+          <wp:inline distT="0" distB="0" distL="0" distR="0" wp14:anchorId="541A2049" wp14:editId="09556EA2">
+            <wp:extent cx="4286250" cy="3248025"/>
+            <wp:effectExtent l="0" t="0" r="0" b="0"/>
+            <wp:docPr id="298121407" name="Picture 298121407"/>
             <wp:cNvGraphicFramePr>
               <a:graphicFrameLocks xmlns:a="http://schemas.openxmlformats.org/drawingml/2006/main" noChangeAspect="1"/>
             </wp:cNvGraphicFramePr>
@@ -8700,7 +9243,7 @@
                   <pic:spPr bwMode="auto">
                     <a:xfrm>
                       <a:off x="0" y="0"/>
-                      <a:ext cx="4762500" cy="3914775"/>
+                      <a:ext cx="4286250" cy="3248025"/>
                     </a:xfrm>
                     <a:prstGeom prst="rect">
                       <a:avLst/>
@@ -8717,9 +9260,6 @@
       <w:pPr>
         <w:spacing w:before="60" w:after="200" w:line="276" w:lineRule="auto"/>
         <w:jc w:val="both"/>
-        <w:rPr>
-          <w:lang w:val="en-US"/>
-        </w:rPr>
       </w:pPr>
       <w:r>
         <w:rPr>
@@ -8727,10 +9267,10 @@
           <w:iCs/>
           <w:sz w:val="18"/>
           <w:szCs w:val="18"/>
-        </w:rPr>
-        <w:t xml:space="preserve">Fig. 4. Key </w:t>
-      </w:r>
-      <w:proofErr w:type="spellStart"/>
+          <w:lang w:val="en-US"/>
+        </w:rPr>
+        <w:t xml:space="preserve">Fig. 3. LPG_C5 vs. NG_RVP trade-off with DOS boundary. The shaded green rectangle represents the feasible DOS region (LPG_C5 ≤ 2 mol%, NG_RVP ≤ 76 kPa). Color scale indicates Revenue ($/h). Feasible points (n = 281) are highlighted in green. </w:t>
+      </w:r>
       <w:r>
         <w:rPr>
           <w:i/>
@@ -8738,9 +9278,9 @@
           <w:sz w:val="18"/>
           <w:szCs w:val="18"/>
         </w:rPr>
-        <w:t>variable</w:t>
-      </w:r>
-      <w:proofErr w:type="spellEnd"/>
+        <w:t xml:space="preserve">Orange star </w:t>
+      </w:r>
+      <w:proofErr w:type="spellStart"/>
       <w:r>
         <w:rPr>
           <w:i/>
@@ -8748,9 +9288,9 @@
           <w:sz w:val="18"/>
           <w:szCs w:val="18"/>
         </w:rPr>
-        <w:t xml:space="preserve"> </w:t>
-      </w:r>
-      <w:proofErr w:type="spellStart"/>
+        <w:t>marks</w:t>
+      </w:r>
+      <w:proofErr w:type="spellEnd"/>
       <w:r>
         <w:rPr>
           <w:i/>
@@ -8758,9 +9298,9 @@
           <w:sz w:val="18"/>
           <w:szCs w:val="18"/>
         </w:rPr>
-        <w:t>correlations</w:t>
-      </w:r>
-      <w:proofErr w:type="spellEnd"/>
+        <w:t xml:space="preserve"> </w:t>
+      </w:r>
+      <w:proofErr w:type="spellStart"/>
       <w:r>
         <w:rPr>
           <w:i/>
@@ -8768,9 +9308,9 @@
           <w:sz w:val="18"/>
           <w:szCs w:val="18"/>
         </w:rPr>
-        <w:t xml:space="preserve">. (a) V-02 </w:t>
-      </w:r>
-      <w:proofErr w:type="spellStart"/>
+        <w:t>the</w:t>
+      </w:r>
+      <w:proofErr w:type="spellEnd"/>
       <w:r>
         <w:rPr>
           <w:i/>
@@ -8778,9 +9318,9 @@
           <w:sz w:val="18"/>
           <w:szCs w:val="18"/>
         </w:rPr>
-        <w:t>temperature</w:t>
-      </w:r>
-      <w:proofErr w:type="spellEnd"/>
+        <w:t xml:space="preserve"> SLSQP </w:t>
+      </w:r>
+      <w:proofErr w:type="spellStart"/>
       <w:r>
         <w:rPr>
           <w:i/>
@@ -8788,9 +9328,9 @@
           <w:sz w:val="18"/>
           <w:szCs w:val="18"/>
         </w:rPr>
-        <w:t xml:space="preserve"> vs. </w:t>
-      </w:r>
-      <w:proofErr w:type="spellStart"/>
+        <w:t>optimal</w:t>
+      </w:r>
+      <w:proofErr w:type="spellEnd"/>
       <w:r>
         <w:rPr>
           <w:i/>
@@ -8798,138 +9338,7 @@
           <w:sz w:val="18"/>
           <w:szCs w:val="18"/>
         </w:rPr>
-        <w:t>Revenue</w:t>
-      </w:r>
-      <w:proofErr w:type="spellEnd"/>
-      <w:r>
-        <w:rPr>
-          <w:i/>
-          <w:iCs/>
-          <w:sz w:val="18"/>
-          <w:szCs w:val="18"/>
-        </w:rPr>
-        <w:t xml:space="preserve"> (r = −0.984); (b) T-01 </w:t>
-      </w:r>
-      <w:proofErr w:type="spellStart"/>
-      <w:r>
-        <w:rPr>
-          <w:i/>
-          <w:iCs/>
-          <w:sz w:val="18"/>
-          <w:szCs w:val="18"/>
-        </w:rPr>
-        <w:t>reboiler</w:t>
-      </w:r>
-      <w:proofErr w:type="spellEnd"/>
-      <w:r>
-        <w:rPr>
-          <w:i/>
-          <w:iCs/>
-          <w:sz w:val="18"/>
-          <w:szCs w:val="18"/>
-        </w:rPr>
-        <w:t xml:space="preserve"> </w:t>
-      </w:r>
-      <w:proofErr w:type="spellStart"/>
-      <w:r>
-        <w:rPr>
-          <w:i/>
-          <w:iCs/>
-          <w:sz w:val="18"/>
-          <w:szCs w:val="18"/>
-        </w:rPr>
-        <w:t>temperature</w:t>
-      </w:r>
-      <w:proofErr w:type="spellEnd"/>
-      <w:r>
-        <w:rPr>
-          <w:i/>
-          <w:iCs/>
-          <w:sz w:val="18"/>
-          <w:szCs w:val="18"/>
-        </w:rPr>
-        <w:t xml:space="preserve"> vs. LPG_C2 (r = −0.970); (c) T-02 </w:t>
-      </w:r>
-      <w:proofErr w:type="spellStart"/>
-      <w:r>
-        <w:rPr>
-          <w:i/>
-          <w:iCs/>
-          <w:sz w:val="18"/>
-          <w:szCs w:val="18"/>
-        </w:rPr>
-        <w:t>reboiler</w:t>
-      </w:r>
-      <w:proofErr w:type="spellEnd"/>
-      <w:r>
-        <w:rPr>
-          <w:i/>
-          <w:iCs/>
-          <w:sz w:val="18"/>
-          <w:szCs w:val="18"/>
-        </w:rPr>
-        <w:t xml:space="preserve"> </w:t>
-      </w:r>
-      <w:proofErr w:type="spellStart"/>
-      <w:r>
-        <w:rPr>
-          <w:i/>
-          <w:iCs/>
-          <w:sz w:val="18"/>
-          <w:szCs w:val="18"/>
-        </w:rPr>
-        <w:t>temperature</w:t>
-      </w:r>
-      <w:proofErr w:type="spellEnd"/>
-      <w:r>
-        <w:rPr>
-          <w:i/>
-          <w:iCs/>
-          <w:sz w:val="18"/>
-          <w:szCs w:val="18"/>
-        </w:rPr>
-        <w:t xml:space="preserve"> vs. NG_RVP (r = −0.976); (d) LPG_C5 vs. NG_RVP (r = −0.650). </w:t>
-      </w:r>
-      <w:r>
-        <w:rPr>
-          <w:i/>
-          <w:iCs/>
-          <w:sz w:val="18"/>
-          <w:szCs w:val="18"/>
-          <w:lang w:val="en-US"/>
-        </w:rPr>
-        <w:t>Green: feasible; red: infeasible. Dashed lines show constraint boundaries.</w:t>
-      </w:r>
-    </w:p>
-    <w:p>
-      <w:pPr>
-        <w:pStyle w:val="Heading2"/>
-        <w:spacing w:line="360" w:lineRule="auto"/>
-        <w:rPr>
-          <w:lang w:val="en-US"/>
-        </w:rPr>
-      </w:pPr>
-      <w:r>
-        <w:rPr>
-          <w:lang w:val="en-US"/>
-        </w:rPr>
-        <w:t>3.4. The LPG_C5–NG_RVP Trade-off: A Fundamental Thermodynamic Coupling</w:t>
-      </w:r>
-    </w:p>
-    <w:p>
-      <w:pPr>
-        <w:spacing w:after="120" w:line="360" w:lineRule="auto"/>
-        <w:ind w:firstLine="706"/>
-        <w:jc w:val="both"/>
-        <w:rPr>
-          <w:lang w:val="en-US"/>
-        </w:rPr>
-      </w:pPr>
-      <w:r>
-        <w:rPr>
-          <w:lang w:val="en-US"/>
-        </w:rPr>
-        <w:t>The most consequential inter-output relationship is the inverse correlation between C₅₊ content in LPG (LPG_C5) and Reid Vapor Pressure of the NG stream (NG_RVP), with r = −0.650. Figure 3 visualizes this trade-off with the DOS boundary region and revenue color-coding.</w:t>
+        <w:t xml:space="preserve"> point.</w:t>
       </w:r>
     </w:p>
     <w:p>
@@ -8941,12 +9350,11 @@
         <w:rPr>
           <w:noProof/>
         </w:rPr>
-        <w:lastRenderedPageBreak/>
         <w:drawing>
-          <wp:inline distT="0" distB="0" distL="0" distR="0" wp14:anchorId="541A2049" wp14:editId="09556EA2">
+          <wp:inline distT="0" distB="0" distL="0" distR="0" wp14:anchorId="2D81F5B9" wp14:editId="6DBC8EE0">
             <wp:extent cx="4286250" cy="3248025"/>
             <wp:effectExtent l="0" t="0" r="0" b="0"/>
-            <wp:docPr id="298121407" name="Picture 298121407"/>
+            <wp:docPr id="413087009" name="Picture 413087009"/>
             <wp:cNvGraphicFramePr>
               <a:graphicFrameLocks xmlns:a="http://schemas.openxmlformats.org/drawingml/2006/main" noChangeAspect="1"/>
             </wp:cNvGraphicFramePr>
@@ -8986,140 +9394,6 @@
       <w:pPr>
         <w:spacing w:before="60" w:after="200" w:line="276" w:lineRule="auto"/>
         <w:jc w:val="both"/>
-      </w:pPr>
-      <w:r>
-        <w:rPr>
-          <w:i/>
-          <w:iCs/>
-          <w:sz w:val="18"/>
-          <w:szCs w:val="18"/>
-          <w:lang w:val="en-US"/>
-        </w:rPr>
-        <w:t xml:space="preserve">Fig. 3. LPG_C5 vs. NG_RVP trade-off with DOS boundary. The shaded green rectangle represents the feasible DOS region (LPG_C5 ≤ 2 mol%, NG_RVP ≤ 76 kPa). Color scale indicates Revenue ($/h). Feasible points (n = 281) are highlighted in green. </w:t>
-      </w:r>
-      <w:r>
-        <w:rPr>
-          <w:i/>
-          <w:iCs/>
-          <w:sz w:val="18"/>
-          <w:szCs w:val="18"/>
-        </w:rPr>
-        <w:t xml:space="preserve">Orange star </w:t>
-      </w:r>
-      <w:proofErr w:type="spellStart"/>
-      <w:r>
-        <w:rPr>
-          <w:i/>
-          <w:iCs/>
-          <w:sz w:val="18"/>
-          <w:szCs w:val="18"/>
-        </w:rPr>
-        <w:t>marks</w:t>
-      </w:r>
-      <w:proofErr w:type="spellEnd"/>
-      <w:r>
-        <w:rPr>
-          <w:i/>
-          <w:iCs/>
-          <w:sz w:val="18"/>
-          <w:szCs w:val="18"/>
-        </w:rPr>
-        <w:t xml:space="preserve"> </w:t>
-      </w:r>
-      <w:proofErr w:type="spellStart"/>
-      <w:r>
-        <w:rPr>
-          <w:i/>
-          <w:iCs/>
-          <w:sz w:val="18"/>
-          <w:szCs w:val="18"/>
-        </w:rPr>
-        <w:t>the</w:t>
-      </w:r>
-      <w:proofErr w:type="spellEnd"/>
-      <w:r>
-        <w:rPr>
-          <w:i/>
-          <w:iCs/>
-          <w:sz w:val="18"/>
-          <w:szCs w:val="18"/>
-        </w:rPr>
-        <w:t xml:space="preserve"> SLSQP </w:t>
-      </w:r>
-      <w:proofErr w:type="spellStart"/>
-      <w:r>
-        <w:rPr>
-          <w:i/>
-          <w:iCs/>
-          <w:sz w:val="18"/>
-          <w:szCs w:val="18"/>
-        </w:rPr>
-        <w:t>optimal</w:t>
-      </w:r>
-      <w:proofErr w:type="spellEnd"/>
-      <w:r>
-        <w:rPr>
-          <w:i/>
-          <w:iCs/>
-          <w:sz w:val="18"/>
-          <w:szCs w:val="18"/>
-        </w:rPr>
-        <w:t xml:space="preserve"> point.</w:t>
-      </w:r>
-    </w:p>
-    <w:p>
-      <w:pPr>
-        <w:spacing w:before="120" w:after="60"/>
-        <w:jc w:val="center"/>
-      </w:pPr>
-      <w:r>
-        <w:rPr>
-          <w:noProof/>
-        </w:rPr>
-        <w:drawing>
-          <wp:inline distT="0" distB="0" distL="0" distR="0" wp14:anchorId="2D81F5B9" wp14:editId="6DBC8EE0">
-            <wp:extent cx="4286250" cy="3248025"/>
-            <wp:effectExtent l="0" t="0" r="0" b="0"/>
-            <wp:docPr id="413087009" name="Picture 413087009"/>
-            <wp:cNvGraphicFramePr>
-              <a:graphicFrameLocks xmlns:a="http://schemas.openxmlformats.org/drawingml/2006/main" noChangeAspect="1"/>
-            </wp:cNvGraphicFramePr>
-            <a:graphic xmlns:a="http://schemas.openxmlformats.org/drawingml/2006/main">
-              <a:graphicData uri="http://schemas.openxmlformats.org/drawingml/2006/picture">
-                <pic:pic xmlns:pic="http://schemas.openxmlformats.org/drawingml/2006/picture">
-                  <pic:nvPicPr>
-                    <pic:cNvPr id="0" name=""/>
-                    <pic:cNvPicPr>
-                      <a:picLocks noChangeAspect="1" noChangeArrowheads="1"/>
-                    </pic:cNvPicPr>
-                  </pic:nvPicPr>
-                  <pic:blipFill>
-                    <a:blip r:embed="rId12"/>
-                    <a:srcRect/>
-                    <a:stretch>
-                      <a:fillRect/>
-                    </a:stretch>
-                  </pic:blipFill>
-                  <pic:spPr bwMode="auto">
-                    <a:xfrm>
-                      <a:off x="0" y="0"/>
-                      <a:ext cx="4286250" cy="3248025"/>
-                    </a:xfrm>
-                    <a:prstGeom prst="rect">
-                      <a:avLst/>
-                    </a:prstGeom>
-                  </pic:spPr>
-                </pic:pic>
-              </a:graphicData>
-            </a:graphic>
-          </wp:inline>
-        </w:drawing>
-      </w:r>
-    </w:p>
-    <w:p>
-      <w:pPr>
-        <w:spacing w:before="60" w:after="200" w:line="276" w:lineRule="auto"/>
-        <w:jc w:val="both"/>
         <w:rPr>
           <w:lang w:val="en-US"/>
         </w:rPr>
@@ -10179,7 +10453,21 @@
         <w:rPr>
           <w:lang w:val="en-US"/>
         </w:rPr>
-        <w:t>Removing constraint g₄ (RVP of NG ≤ 76 kPa) yields the largest OI increase (+21.4 percentage points, from 14.1% to 35.5%), confirming its status as the dominant bottleneck. Removing g₃ (C₅₊ in LPG ≤ 2 mol%) yields a nearly equivalent improvement (+20.7 pp), which is expected given the strong inverse coupling between g₃ and g₄ established in Section 3.4: relaxing either member of the coupled pair releases the other. Removing g₂ (ethane in LPG ≤ 12 mol%) yields a moderate improvement (+9.0 pp), while removing g₁ has no effect, consistent with its universal satisfaction.</w:t>
+        <w:t xml:space="preserve">Removing constraint g₄ (RVP of NG ≤ 76 kPa) yields the largest OI increase (+21.4 percentage points, from 14.1% to 35.5%), confirming its status as the dominant bottleneck. Removing g₃ (C₅₊ in LPG ≤ 2 mol%) yields a nearly equivalent improvement (+20.7 pp), which is expected given the strong inverse coupling between g₃ and g₄ established in Section 3.4: relaxing </w:t>
+      </w:r>
+      <w:proofErr w:type="gramStart"/>
+      <w:r>
+        <w:rPr>
+          <w:lang w:val="en-US"/>
+        </w:rPr>
+        <w:t>either member</w:t>
+      </w:r>
+      <w:proofErr w:type="gramEnd"/>
+      <w:r>
+        <w:rPr>
+          <w:lang w:val="en-US"/>
+        </w:rPr>
+        <w:t xml:space="preserve"> of the coupled pair releases the other. Removing g₂ (ethane in LPG ≤ 12 mol%) yields a moderate improvement (+9.0 pp), while removing g₁ has no effect, consistent with its universal satisfaction.</w:t>
       </w:r>
     </w:p>
     <w:p>
@@ -10270,7 +10558,21 @@
         <w:rPr>
           <w:lang w:val="en-US"/>
         </w:rPr>
-        <w:t xml:space="preserve">Table 7 presents the optimized operating point. The SLSQP solution achieves a sales revenue of 663.85 $/h, representing a 7.1% improvement over the best feasible point identified by LHS sampling (619.89 $/h). The optimizer drives the cold separator temperature to the lower bound of the AIS (−33.00 °C), maximizing liquid recovery and confirming the dominant role of this variable in revenue generation (|r| = 0.984). The </w:t>
+        <w:t xml:space="preserve">Table 7 presents the optimized operating point. The SLSQP solution achieves </w:t>
+      </w:r>
+      <w:proofErr w:type="gramStart"/>
+      <w:r>
+        <w:rPr>
+          <w:lang w:val="en-US"/>
+        </w:rPr>
+        <w:t>a sales</w:t>
+      </w:r>
+      <w:proofErr w:type="gramEnd"/>
+      <w:r>
+        <w:rPr>
+          <w:lang w:val="en-US"/>
+        </w:rPr>
+        <w:t xml:space="preserve"> revenue of 663.85 $/h, representing a 7.1% improvement over the best feasible point identified by LHS sampling (619.89 $/h). The optimizer drives the cold separator temperature to the lower bound of the AIS (−33.00 °C), maximizing liquid recovery and confirming the dominant role of this variable in revenue generation (|r| = 0.984). The </w:t>
       </w:r>
       <w:proofErr w:type="spellStart"/>
       <w:r>
@@ -11906,7 +12208,21 @@
         <w:rPr>
           <w:lang w:val="en-US"/>
         </w:rPr>
-        <w:t xml:space="preserve"> the optimum is—it tells us </w:t>
+        <w:t xml:space="preserve"> the optimum </w:t>
+      </w:r>
+      <w:proofErr w:type="gramStart"/>
+      <w:r>
+        <w:rPr>
+          <w:lang w:val="en-US"/>
+        </w:rPr>
+        <w:t>is—</w:t>
+      </w:r>
+      <w:proofErr w:type="gramEnd"/>
+      <w:r>
+        <w:rPr>
+          <w:lang w:val="en-US"/>
+        </w:rPr>
+        <w:t xml:space="preserve">it tells us </w:t>
       </w:r>
       <w:r>
         <w:rPr>
@@ -11936,7 +12252,21 @@
         <w:rPr>
           <w:lang w:val="en-US"/>
         </w:rPr>
-        <w:t>Within the operability literature, Carrasco and Lima (2017) applied the framework to modular natural gas utilization systems focusing on design intensification rather than regulatory-constraint mapping. Dinh and Lima (2023) addressed dynamic operability of methane-to-aromatics reactors. Ferreira et al. (2025) demonstrated flowsheet-level operability analysis using commercial simulators. The present work extends this body of knowledge by applying the framework to a conventional multi-column gas plant with explicit ANP regulatory constraints—a configuration representative of the majority of gas processing facilities in Brazil.</w:t>
+        <w:t xml:space="preserve">Within the operability literature, Carrasco and Lima (2017) applied the framework to modular natural gas utilization systems focusing on design intensification rather than regulatory-constraint mapping. Dinh and Lima (2023) addressed dynamic operability of methane-to-aromatics reactors. Ferreira et al. (2025) demonstrated flowsheet-level operability analysis using commercial simulators. The present work extends this body of knowledge by applying the framework to a conventional multi-column gas plant with explicit ANP regulatory constraints—a configuration representative of </w:t>
+      </w:r>
+      <w:proofErr w:type="gramStart"/>
+      <w:r>
+        <w:rPr>
+          <w:lang w:val="en-US"/>
+        </w:rPr>
+        <w:t>the majority of</w:t>
+      </w:r>
+      <w:proofErr w:type="gramEnd"/>
+      <w:r>
+        <w:rPr>
+          <w:lang w:val="en-US"/>
+        </w:rPr>
+        <w:t xml:space="preserve"> gas processing facilities in Brazil.</w:t>
       </w:r>
     </w:p>
     <w:p>
@@ -12436,15 +12766,28 @@
         </w:rPr>
         <w:t xml:space="preserve">The datasets, simulation files, and analysis scripts are available at: </w:t>
       </w:r>
-      <w:hyperlink r:id="rId13" w:history="1">
-        <w:r>
-          <w:rPr>
-            <w:rStyle w:val="Hyperlink"/>
-            <w:lang w:val="en-US"/>
-          </w:rPr>
-          <w:t>https://github.com/Spogis/operability-natural-gas-processing</w:t>
-        </w:r>
-      </w:hyperlink>
+      <w:r>
+        <w:fldChar w:fldCharType="begin"/>
+      </w:r>
+      <w:r>
+        <w:rPr>
+          <w:lang w:val="en-US"/>
+        </w:rPr>
+        <w:instrText>HYPERLINK "https://github.com/Spogis/operability-natural-gas-processing"</w:instrText>
+      </w:r>
+      <w:r>
+        <w:fldChar w:fldCharType="separate"/>
+      </w:r>
+      <w:r>
+        <w:rPr>
+          <w:rStyle w:val="Hyperlink"/>
+          <w:lang w:val="en-US"/>
+        </w:rPr>
+        <w:t>https://github.com/Spogis/operability-natural-gas-processing</w:t>
+      </w:r>
+      <w:r>
+        <w:fldChar w:fldCharType="end"/>
+      </w:r>
     </w:p>
     <w:p>
       <w:pPr>
@@ -12709,9 +13052,16 @@
         <w:rPr>
           <w:sz w:val="20"/>
           <w:szCs w:val="20"/>
-          <w:lang w:val="en-US"/>
-        </w:rPr>
-        <w:t>Carrasco, J.C., Lima, F.V., 2017. An optimization-based operability framework for process design and intensification of modular natural gas utilization systems. Comput. Chem. Eng. 105, 246–258.</w:t>
+        </w:rPr>
+        <w:t xml:space="preserve">Carrasco, J.C., Lima, F.V., 2017. </w:t>
+      </w:r>
+      <w:r>
+        <w:rPr>
+          <w:sz w:val="20"/>
+          <w:szCs w:val="20"/>
+          <w:lang w:val="en-US"/>
+        </w:rPr>
+        <w:t>An optimization-based operability framework for process design and intensification of modular natural gas utilization systems. Comput. Chem. Eng. 105, 246–258.</w:t>
       </w:r>
     </w:p>
     <w:p>
@@ -12914,7 +13264,25 @@
           <w:szCs w:val="20"/>
           <w:lang w:val="en-US"/>
         </w:rPr>
-        <w:t>Medeiros, D.W., 2024. DWSIM – Open Source Chemical Process Simulator, version 9.0. https://dwsim.org.</w:t>
+        <w:t xml:space="preserve">Medeiros, D.W., 2024. DWSIM – </w:t>
+      </w:r>
+      <w:proofErr w:type="gramStart"/>
+      <w:r>
+        <w:rPr>
+          <w:sz w:val="20"/>
+          <w:szCs w:val="20"/>
+          <w:lang w:val="en-US"/>
+        </w:rPr>
+        <w:t>Open Source</w:t>
+      </w:r>
+      <w:proofErr w:type="gramEnd"/>
+      <w:r>
+        <w:rPr>
+          <w:sz w:val="20"/>
+          <w:szCs w:val="20"/>
+          <w:lang w:val="en-US"/>
+        </w:rPr>
+        <w:t xml:space="preserve"> Chemical Process Simulator, version 9.0. https://dwsim.org.</w:t>
       </w:r>
     </w:p>
     <w:p>
@@ -13030,72 +13398,54 @@
       <w:pPr>
         <w:spacing w:after="60" w:line="360" w:lineRule="auto"/>
         <w:jc w:val="both"/>
+        <w:rPr>
+          <w:sz w:val="20"/>
+          <w:szCs w:val="20"/>
+          <w:lang w:val="en-US"/>
+        </w:rPr>
+      </w:pPr>
+      <w:r>
+        <w:rPr>
+          <w:sz w:val="20"/>
+          <w:szCs w:val="20"/>
+          <w:lang w:val="en-US"/>
+        </w:rPr>
+        <w:t xml:space="preserve">Virtanen, P., Gommers, R., Oliphant, T.E., et al., 2020. SciPy 1.0: Fundamental algorithms for scientific computing in Python. </w:t>
+      </w:r>
+      <w:r>
+        <w:rPr>
+          <w:sz w:val="20"/>
+          <w:szCs w:val="20"/>
+          <w:lang w:val="en-US"/>
+        </w:rPr>
+        <w:t>Nat. Methods 17, 261–272.</w:t>
+      </w:r>
+    </w:p>
+    <w:p>
+      <w:pPr>
+        <w:spacing w:after="60" w:line="360" w:lineRule="auto"/>
+        <w:jc w:val="both"/>
+      </w:pPr>
+      <w:r>
+        <w:rPr>
+          <w:sz w:val="20"/>
+          <w:szCs w:val="20"/>
+          <w:lang w:val="en-US"/>
+        </w:rPr>
+        <w:t xml:space="preserve">Zhang, B.-J., Chen, Q.-L., Li, J., Floudas, C.A., 2017. Operational strategy and planning for raw natural gas refining complexes: Process modeling and global optimization. </w:t>
+      </w:r>
+      <w:r>
         <w:rPr>
           <w:sz w:val="20"/>
           <w:szCs w:val="20"/>
           <w:lang w:val="es-419"/>
         </w:rPr>
-      </w:pPr>
-      <w:r>
-        <w:rPr>
-          <w:sz w:val="20"/>
-          <w:szCs w:val="20"/>
-          <w:lang w:val="en-US"/>
-        </w:rPr>
-        <w:t xml:space="preserve">Virtanen, P., Gommers, R., Oliphant, T.E., et al., 2020. SciPy 1.0: Fundamental algorithms for scientific computing in Python. </w:t>
-      </w:r>
-      <w:r>
-        <w:rPr>
-          <w:sz w:val="20"/>
-          <w:szCs w:val="20"/>
-          <w:lang w:val="es-419"/>
-        </w:rPr>
-        <w:t xml:space="preserve">Nat. </w:t>
-      </w:r>
-      <w:proofErr w:type="spellStart"/>
-      <w:r>
-        <w:rPr>
-          <w:sz w:val="20"/>
-          <w:szCs w:val="20"/>
-          <w:lang w:val="es-419"/>
-        </w:rPr>
-        <w:t>Methods</w:t>
-      </w:r>
-      <w:proofErr w:type="spellEnd"/>
-      <w:r>
-        <w:rPr>
-          <w:sz w:val="20"/>
-          <w:szCs w:val="20"/>
-          <w:lang w:val="es-419"/>
-        </w:rPr>
-        <w:t xml:space="preserve"> 17, 261–272.</w:t>
-      </w:r>
-    </w:p>
-    <w:p>
-      <w:pPr>
-        <w:spacing w:after="60" w:line="360" w:lineRule="auto"/>
-        <w:jc w:val="both"/>
-      </w:pPr>
-      <w:r>
-        <w:rPr>
-          <w:sz w:val="20"/>
-          <w:szCs w:val="20"/>
-          <w:lang w:val="en-US"/>
-        </w:rPr>
-        <w:t xml:space="preserve">Zhang, B.-J., Chen, Q.-L., Li, J., Floudas, C.A., 2017. Operational strategy and planning for raw natural gas refining complexes: Process modeling and global optimization. </w:t>
-      </w:r>
-      <w:r>
-        <w:rPr>
-          <w:sz w:val="20"/>
-          <w:szCs w:val="20"/>
-          <w:lang w:val="es-419"/>
-        </w:rPr>
         <w:t>AIChE J. 63(2), 652–668.</w:t>
       </w:r>
     </w:p>
     <w:sectPr>
-      <w:headerReference w:type="default" r:id="rId14"/>
-      <w:footerReference w:type="default" r:id="rId15"/>
+      <w:headerReference w:type="default" r:id="rId12"/>
+      <w:footerReference w:type="default" r:id="rId13"/>
       <w:pgSz w:w="11906" w:h="16838"/>
       <w:pgMar w:top="1440" w:right="1440" w:bottom="1440" w:left="1440" w:header="708" w:footer="708" w:gutter="0"/>
       <w:cols w:space="720"/>

</xml_diff>